<commit_message>
Submission-ready: 264 analysis controls, submission files, vector figures
</commit_message>
<xml_diff>
--- a/hf-crosstalk-manuscript.docx
+++ b/hf-crosstalk-manuscript.docx
@@ -11,7 +11,7 @@
           <w:b/>
           <w:sz w:val="32"/>
         </w:rPr>
-        <w:t>An Agent-Skill Pipeline Finds No Match Between Heart-Failure Signals and Tumor Receptors in 30 Cancer Types</w:t>
+        <w:t>A multi-agent skill pipeline finds no tumor-selective heart-failure ligand–receptor axis across 30 tumor types under rank-based source criteria</w:t>
       </w:r>
     </w:p>
     <w:p>
@@ -22,7 +22,7 @@
         <w:rPr>
           <w:vertAlign w:val="superscript"/>
         </w:rPr>
-        <w:t>1</w:t>
+        <w:t>a,b</w:t>
       </w:r>
       <w:r>
         <w:t>, Ruidong Zhang</w:t>
@@ -31,7 +31,7 @@
         <w:rPr>
           <w:vertAlign w:val="superscript"/>
         </w:rPr>
-        <w:t>2</w:t>
+        <w:t>b</w:t>
       </w:r>
       <w:r>
         <w:t>, Yi Pan</w:t>
@@ -40,7 +40,7 @@
         <w:rPr>
           <w:vertAlign w:val="superscript"/>
         </w:rPr>
-        <w:t>2</w:t>
+        <w:t>b</w:t>
       </w:r>
     </w:p>
     <w:p>
@@ -48,7 +48,7 @@
         <w:rPr>
           <w:vertAlign w:val="superscript"/>
         </w:rPr>
-        <w:t>1</w:t>
+        <w:t>a</w:t>
       </w:r>
       <w:r>
         <w:t xml:space="preserve"> North Oconee High School, Bogart, GA, USA</w:t>
@@ -59,10 +59,10 @@
         <w:rPr>
           <w:vertAlign w:val="superscript"/>
         </w:rPr>
-        <w:t>2</w:t>
-      </w:r>
-      <w:r>
-        <w:t xml:space="preserve"> University of Georgia, Athens, GA, USA</w:t>
+        <w:t>b</w:t>
+      </w:r>
+      <w:r>
+        <w:t xml:space="preserve"> School of Computing, University of Georgia, 200 D.W. Brooks Drive, Athens, GA 30602, USA</w:t>
       </w:r>
     </w:p>
     <w:p>
@@ -73,7 +73,7 @@
         <w:t>Corresponding author:</w:t>
       </w:r>
       <w:r>
-        <w:t xml:space="preserve"> Nicolas Avelar, North Oconee High School, Bogart, GA, USA. E-mail: navelar773@gmail.com</w:t>
+        <w:t xml:space="preserve"> Nicolas Avelar, School of Computing, University of Georgia, 200 D.W. Brooks Drive, Athens, GA 30602, USA. E-mail: navelar773@gmail.com</w:t>
       </w:r>
     </w:p>
     <w:p>
@@ -104,7 +104,7 @@
         <w:spacing w:line="480" w:lineRule="auto"/>
       </w:pPr>
       <w:r>
-        <w:t>No axis paired a cardiac-specific ligand with a tumor-enriched receptor</w:t>
+        <w:t>No cardiac-specific ligand had a tumor-enriched receptor under rank-based criteria</w:t>
       </w:r>
     </w:p>
     <w:p>
@@ -155,7 +155,7 @@
         <w:t>Background.</w:t>
       </w:r>
       <w:r>
-        <w:t xml:space="preserve"> Heart failure may accelerate tumor growth through circulating factors. Testing it across many tumor types is a data-integration problem an autonomous agent can now execute end to end, with the risk that its methodological errors leave no trace in its output.</w:t>
+        <w:t xml:space="preserve"> Heart failure may accelerate tumor growth through circulating factors. Testing this across tumor types is an integration problem increasingly delegated to autonomous agents, whose errors leave no trace in their output.</w:t>
       </w:r>
     </w:p>
     <w:p>
@@ -166,7 +166,7 @@
         <w:t>Methods.</w:t>
       </w:r>
       <w:r>
-        <w:t xml:space="preserve"> A hierarchical multi-agent system (one orchestrator, 23 isolated sub-agents, five waves) executed the screen using six reusable skills carrying 141 guardrail checks written as assertions that halt execution rather than as methods-section advice. A heart-failure signature from two RNA-seq cohorts (n=64; n=360), re-tested in three microarray cohorts, was intersected with the secretome and a ligand-receptor database and scored against receptor expression in 9,538 TCGA primary solid tumors across 30 types.</w:t>
+        <w:t xml:space="preserve"> A multi-agent system (23 sub-agents in five waves) executed the screen using six reusable skills whose methodological requirements are assertions that halt execution rather than advice. A heart-failure signature from two RNA-seq cohorts (n=64; n=360), re-tested in three microarray cohorts, was intersected with the secretome and a ligand-receptor database and scored against receptor expression in 9,538 TCGA tumors of 30 types.</w:t>
       </w:r>
     </w:p>
     <w:p>
@@ -177,7 +177,7 @@
         <w:t>Results.</w:t>
       </w:r>
       <w:r>
-        <w:t xml:space="preserve"> No axis had both a distinctively cardiac ligand and a tumor-enriched receptor. NPR1, the sole floor-passing receptor for the only two cardiac-enriched ligands NPPA and NPPB, was depleted in tumor relative to matched adjacent normal in all 15 testable types (median log2FC -1.91, all FDR&lt;0.05). Two guardrails proved load-bearing, both written after the pipeline made the corresponding error: without an expression floor, matched random receptor sets reproduced the ranking (rho=0.363), which a floor reduced to rho=0.107. Re-scoring cardiac specificity by failure induction recovered seven pleiotrophin axes; kill criteria fixed beforehand withdrew all seven.</w:t>
+        <w:t xml:space="preserve"> Under rank-based source criteria, no axis had both a cardiac-distinctive ligand and a tumor-enriched receptor; the negative is definition-dependent: requiring only that the heart exceed the cross-tissue median returns 29 axes. NPR1, the only curated receptor for NPPA and NPPB, was depleted against matched adjacent normal in all 15 testable types (median log2FC -1.91), as were NPR2 and NPR3. Two guardrails proved load-bearing, each written after the pipeline made the error it prevents: without an expression floor, matched random receptor sets reproduced the ranking (rho=0.363 versus 0.107 with it). Failure-induction re-scoring recovered seven pleiotrophin axes, all withdrawn by pre-specified kill criteria.</w:t>
       </w:r>
     </w:p>
     <w:p>
@@ -403,10 +403,10 @@
         <w:rPr>
           <w:b/>
         </w:rPr>
-        <w:t>NPR1</w:t>
-      </w:r>
-      <w:r>
-        <w:t xml:space="preserve"> — Natriuretic peptide receptor 1</w:t>
+        <w:t>NPR1 / NPR2 / NPR3</w:t>
+      </w:r>
+      <w:r>
+        <w:t xml:space="preserve"> — Natriuretic peptide receptor 1 / 2 / 3</w:t>
       </w:r>
     </w:p>
     <w:p>
@@ -704,7 +704,7 @@
     </w:p>
     <w:p>
       <w:r>
-        <w:t>Cross-platform replication (Section 3.10) used three further cohorts, all Affymetrix microarray and none used elsewhere: GSE5406 (194 failing, 16 non-failing; GPL96), GSE57345 (177 failing, 136 non-failing; GPL11532) and GSE1869 (31 failing, 6 non-failing; GPL96)</w:t>
+        <w:t>Cross-platform replication (Section 3.10) used three further cohorts, all Affymetrix microarray and none used elsewhere: GSE5406 (194 failing, 16 non-failing; GPL96), GSE57345 (177 failing, 136 non-failing; GPL11532) and GSE1869 (31 failing, 6 non-failing; GPL96).</w:t>
       </w:r>
       <w:r>
         <w:rPr>
@@ -713,12 +713,12 @@
         <w:t>15,16</w:t>
       </w:r>
       <w:r>
-        <w:t>. Probe-level values were collapsed to genes by maximum mean intensity with a deterministic tie-break. Probes annotated to several genes were dropped rather than assigned to the first listed gene, and log scale was detected from the values rather than assumed.</w:t>
-      </w:r>
-    </w:p>
-    <w:p>
-      <w:r>
-        <w:t>Protein abundance (Section 3.11) came from eight CPTAC tandem-mass-tag proteome studies in the Proteomic Data Commons</w:t>
+        <w:t xml:space="preserve"> Probe-level values were collapsed to genes by maximum mean intensity with a deterministic tie-break. Probes annotated to several genes were dropped rather than assigned to the first listed gene, and log scale was detected from the values rather than assumed.</w:t>
+      </w:r>
+    </w:p>
+    <w:p>
+      <w:r>
+        <w:t>Protein abundance (Section 3.12) came from eight CPTAC tandem-mass-tag proteome studies in the Proteomic Data Commons</w:t>
       </w:r>
       <w:r>
         <w:rPr>
@@ -800,7 +800,7 @@
         <w:t>30–32</w:t>
       </w:r>
       <w:r>
-        <w:t xml:space="preserve"> the DepMap release is resolved through the figshare API and the payload is asserted not to be HTML, since storing an error page as data yields plausible but meaningless output. Non-cardiac fibrosis cohorts for Section 3.9 were GSE150910 and GSE134692 (lung, idiopathic pulmonary fibrosis), GSE126848 and GSE130970 (liver, NASH/NAFLD) and GSE142025 (kidney, diabetic nephropathy)</w:t>
+        <w:t xml:space="preserve"> the DepMap release is resolved through the figshare API and the payload is asserted not to be HTML, since storing an error page as data yields plausible but meaningless output. Non-cardiac fibrosis cohorts for Section 3.9 were GSE150910 and GSE134692 (lung, idiopathic pulmonary fibrosis), GSE126848 and GSE130970 (liver, NASH/NAFLD) and GSE142025 (kidney, diabetic nephropathy).</w:t>
       </w:r>
       <w:r>
         <w:rPr>
@@ -809,16 +809,13 @@
         <w:t>33–36</w:t>
       </w:r>
       <w:r>
-        <w:t>. Human heart single-nucleus atlases (Reichart dilated and arrhythmogenic cardiomyopathy; Kuppe myocardial infarction) were obtained via CELLxGENE Census</w:t>
+        <w:t xml:space="preserve"> Human heart single-nucleus atlases (Reichart dilated and arrhythmogenic cardiomyopathy; Kuppe myocardial infarction) were obtained via CELLxGENE Census.</w:t>
       </w:r>
       <w:r>
         <w:rPr>
           <w:vertAlign w:val="superscript"/>
         </w:rPr>
         <w:t>37–39</w:t>
-      </w:r>
-      <w:r>
-        <w:t>.</w:t>
       </w:r>
     </w:p>
     <w:p>
@@ -836,7 +833,7 @@
     </w:p>
     <w:p>
       <w:r>
-        <w:t>This section is the geo-bulk-de skill. Each cohort was analyzed separately, on its own scale, with an empirical-Bayes moderated t-test equivalent to limma-trend implemented directly in NumPy and SciPy</w:t>
+        <w:t>This section is the geo-bulk-de skill. Each cohort was analyzed separately, on its own scale, with an empirical-Bayes moderated t-test equivalent to limma-trend implemented directly in NumPy and SciPy.</w:t>
       </w:r>
       <w:r>
         <w:rPr>
@@ -845,7 +842,7 @@
         <w:t>40–42</w:t>
       </w:r>
       <w:r>
-        <w:t>. Genes were retained when expression exceeded 1.0 (RPKM or CPM as appropriate) in at least 20% of the smaller group’s samples, and 65 genes carrying a sentinel value of 999999999.0 were detected and dropped from GSE116250. The prior degrees of freedom fitted to 3.04 in discovery and 4.82 in validation, and the variance trend used a 0.4 lowess fraction. Multiplicity was controlled by Benjamini–Hochberg FDR at 0.05</w:t>
+        <w:t xml:space="preserve"> Genes were retained when expression exceeded 1.0 (RPKM or CPM as appropriate) in at least 20% of the smaller group’s samples, and 65 genes carrying a sentinel value of 999999999.0 were detected and dropped from GSE116250. The prior degrees of freedom fitted to 3.04 in discovery and 4.82 in validation, and the variance trend used a 0.4 lowess fraction. Multiplicity was controlled by Benjamini–Hochberg FDR at 0.05.</w:t>
       </w:r>
       <w:r>
         <w:rPr>
@@ -854,7 +851,7 @@
         <w:t>43</w:t>
       </w:r>
       <w:r>
-        <w:t>. Ensembl identifiers were version-stripped before intersecting the cohorts, yielding 18,061 shared genes.</w:t>
+        <w:t xml:space="preserve"> Ensembl identifiers were version-stripped before intersecting the cohorts, yielding 18,061 shared genes.</w:t>
       </w:r>
     </w:p>
     <w:p>
@@ -1545,7 +1542,7 @@
     </w:p>
     <w:p>
       <w:r>
-        <w:t>Each sub-agent received a task statement and a context summary rather than the orchestrator’s conversation, and returned results as artifacts plus a structured output object. That isolation is the reason the split is worth making, since a sub-agent cannot inherit an assumption the orchestrator formed earlier, and two of the wave-4 audit tracks were dispatched specifically to check claims the orchestrator had already written down.</w:t>
+        <w:t>Each sub-agent received a task statement and a context summary rather than the orchestrator’s conversation, and returned results as artifacts plus a structured output object. This isolation is the principal justification for partitioning the work, since a sub-agent cannot inherit an assumption the orchestrator formed earlier, and two of the wave-4 audit tracks were dispatched specifically to check claims the orchestrator had already written down.</w:t>
       </w:r>
     </w:p>
     <w:p>
@@ -1556,7 +1553,7 @@
       <w:r>
         <w:drawing>
           <wp:inline xmlns:a="http://schemas.openxmlformats.org/drawingml/2006/main" xmlns:pic="http://schemas.openxmlformats.org/drawingml/2006/picture">
-            <wp:extent cx="5760720" cy="2925558"/>
+            <wp:extent cx="5760720" cy="2917305"/>
             <wp:docPr id="1" name="Picture 1"/>
             <wp:cNvGraphicFramePr>
               <a:graphicFrameLocks noChangeAspect="1"/>
@@ -1577,7 +1574,7 @@
                   <pic:spPr>
                     <a:xfrm>
                       <a:off x="0" y="0"/>
-                      <a:ext cx="5760720" cy="2925558"/>
+                      <a:ext cx="5760720" cy="2917305"/>
                     </a:xfrm>
                     <a:prstGeom prst="rect"/>
                   </pic:spPr>
@@ -1609,129 +1606,7 @@
     </w:p>
     <w:p>
       <w:r>
-        <w:t>The sub-agent fleet consumed $164 at 2026 API prices, with an input:output token ratio of 106:1, so essentially all of the cost is context rather than generation. Median track duration was 44 minutes. This is the figure that makes the division of Section 4.6 practical rather than rhetorical, since the deterministic modules those agents called cost nothing per invocation, and re-running the entire computational analysis from the six skills requires no model at all.</w:t>
-      </w:r>
-    </w:p>
-    <w:p>
-      <w:pPr>
-        <w:pStyle w:val="Heading3"/>
-        <w:spacing w:line="240" w:lineRule="auto"/>
-      </w:pPr>
-      <w:r>
-        <w:rPr>
-          <w:rFonts w:ascii="Times New Roman" w:hAnsi="Times New Roman"/>
-          <w:color w:val="000000"/>
-        </w:rPr>
-        <w:t>2.12 Statistical analysis conventions</w:t>
-      </w:r>
-    </w:p>
-    <w:p>
-      <w:r>
-        <w:t>This section collects, in one place, the statistical conventions applied throughout Sections 2 and 3; each is also introduced at the point it is first used.</w:t>
-      </w:r>
-    </w:p>
-    <w:p>
-      <w:r>
-        <w:rPr>
-          <w:b/>
-        </w:rPr>
-        <w:t>Software.</w:t>
-      </w:r>
-      <w:r>
-        <w:t xml:space="preserve"> All statistical procedures were implemented directly in NumPy and SciPy, with pandas for data handling, statsmodels where noted, and requests for retrieval</w:t>
-      </w:r>
-      <w:r>
-        <w:rPr>
-          <w:vertAlign w:val="superscript"/>
-        </w:rPr>
-        <w:t>45,46</w:t>
-      </w:r>
-      <w:r>
-        <w:t>; rdata was used for one optional file reader. No procedure calls a language model, an external API for computation, or a platform-specific function (Section 2.10).</w:t>
-      </w:r>
-    </w:p>
-    <w:p>
-      <w:r>
-        <w:rPr>
-          <w:b/>
-        </w:rPr>
-        <w:t>Differential expression.</w:t>
-      </w:r>
-      <w:r>
-        <w:t xml:space="preserve"> Each cohort was analyzed on its own scale with an empirical-Bayes moderated t-test equivalent to limma-trend [40-42], validated against canonical limma 3.66.0 with a criterion fixed in advance (Section 2.2). Multiplicity was controlled by Benjamini-Hochberg FDR at 0.05 within each cohort or tumor type</w:t>
-      </w:r>
-      <w:r>
-        <w:rPr>
-          <w:vertAlign w:val="superscript"/>
-        </w:rPr>
-        <w:t>43</w:t>
-      </w:r>
-      <w:r>
-        <w:t>.</w:t>
-      </w:r>
-    </w:p>
-    <w:p>
-      <w:r>
-        <w:rPr>
-          <w:b/>
-        </w:rPr>
-        <w:t>Correlation and replication.</w:t>
-      </w:r>
-      <w:r>
-        <w:t xml:space="preserve"> Cross-cohort and cross-platform replication is reported as directional concordance and Spearman/Pearson correlation of log fold change among genes significant in both cohorts, not as a hypergeometric overlap test alone; the latter is reported alongside its fold enrichment because it saturates when a large fraction of genes are significant in both cohorts (Sections 2.2, 3.1, 3.10).</w:t>
-      </w:r>
-    </w:p>
-    <w:p>
-      <w:r>
-        <w:rPr>
-          <w:b/>
-        </w:rPr>
-        <w:t>Resampling and permutation.</w:t>
-      </w:r>
-      <w:r>
-        <w:t xml:space="preserve"> Bootstrap confidence intervals (400 resamples) and permutation nulls (300-20,000 draws depending on the test) used fixed random seeds, documented per procedure in Section 2.10 (20260727 for the specificity permutation and bootstrap; 42 for the differential-expression label permutation; 20260728 for the induction-criteria phase; 20260729 for the adversarial receptor null). Permutation p-values are one-sided empirical estimates (fraction of null draws meeting or exceeding the observed statistic) unless stated otherwise, and resolution limits relative to the number of draws are reported explicitly where a p-value approaches 1/N (Section 3.3).</w:t>
-      </w:r>
-    </w:p>
-    <w:p>
-      <w:r>
-        <w:rPr>
-          <w:b/>
-        </w:rPr>
-        <w:t>Survival and genomic association.</w:t>
-      </w:r>
-      <w:r>
-        <w:t xml:space="preserve"> Cox proportional-hazards models</w:t>
-      </w:r>
-      <w:r>
-        <w:rPr>
-          <w:vertAlign w:val="superscript"/>
-        </w:rPr>
-        <w:t>44</w:t>
-      </w:r>
-      <w:r>
-        <w:t xml:space="preserve"> were stratified by tumor type with the receptor z-scored within type; copy-number associations were tested against a matched null of 1,000 loci sampled on chromosome arm and segment length (Section 2.8).</w:t>
-      </w:r>
-    </w:p>
-    <w:p>
-      <w:r>
-        <w:rPr>
-          <w:b/>
-        </w:rPr>
-        <w:t>Batch and design checks.</w:t>
-      </w:r>
-      <w:r>
-        <w:t xml:space="preserve"> Proteomic contrasts were tested for arm-batch confounding by chi-square test before any effect estimate was interpreted, and a study was excluded from testing rather than analyzed through a confound (Section 3.11).</w:t>
-      </w:r>
-    </w:p>
-    <w:p>
-      <w:r>
-        <w:rPr>
-          <w:b/>
-        </w:rPr>
-        <w:t>Pre-specification and alpha level.</w:t>
-      </w:r>
-      <w:r>
-        <w:t xml:space="preserve"> All thresholds used to declare a result significant, an axis surviving, or a test uninformative were fixed before the analysis phase in which they were applied (Sections 2.5-2.8, 3.9), and are reported as fixed even where the observed value fell close to the threshold (e.g., Section 3.9, Track 2). Unless otherwise noted, statistical tests are two-sided at α = 0.05 after multiplicity correction; permutation and bootstrap procedures are described above.</w:t>
+        <w:t>The sub-agent fleet consumed $164 at 2026 API prices, with an input:output token ratio of 106:1, so essentially all of the cost is context rather than generation. Median track duration was 44 minutes. This is the figure that makes the division of Section 4.7 practical rather than rhetorical, since the deterministic modules those agents called cost nothing per invocation, and re-running the entire computational analysis from the six skills requires no model at all.</w:t>
       </w:r>
     </w:p>
     <w:p>
@@ -1835,7 +1710,7 @@
         <w:t>Figure 2.</w:t>
       </w:r>
       <w:r>
-        <w:t xml:space="preserve"> Replication of the heart-failure expression signature. (a) Discovery volcano, GSE116250. (b) Cross-cohort effect-size concordance among genes significant in both; red points disagree in direction. (c) Concordance increases with discovery effect size.</w:t>
+        <w:t xml:space="preserve"> Replication of the heart-failure expression signature. (a) Discovery volcano, GSE116250 (50 failing, 14 non-failing left ventricle); empirical-Bayes moderated t, Benjamini-Hochberg FDR. (b) Cross-cohort effect-size concordance among the 5,717 genes significant in both cohorts (Spearman rho=0.759; rho=0.541 across all 18,061 shared genes); red points disagree in direction. (c) Directional concordance rises with discovery effect size, from 85% below |log2FC| 0.5 to 95% above 1.0. Validation cohort GSE141910 (194 cardiomyopathy, 166 non-failing). Label permutation returned 0 significant genes.</w:t>
       </w:r>
     </w:p>
     <w:p>
@@ -1871,7 +1746,7 @@
           <w:rFonts w:ascii="Times New Roman" w:hAnsi="Times New Roman"/>
           <w:color w:val="000000"/>
         </w:rPr>
-        <w:t>3.3 The expression floor is the load-bearing methodological choice</w:t>
+        <w:t>3.3 The absolute expression floor as a determinant of the result</w:t>
       </w:r>
     </w:p>
     <w:p>
@@ -1938,7 +1813,7 @@
     </w:p>
     <w:p>
       <w:r>
-        <w:t>Two conclusions follow. The global expression axis confound that afflicts co-expression rankings is substantially caused by scoring untranscribed receptors; remove them and the ranking becomes receptor-specific. Separately, the null pool must itself be expression-matched, since a naive pool gives ρ=0.323 and would wrongly condemn a specific score (Fig. 3).</w:t>
+        <w:t>The global expression-axis confound affecting co-expression rankings is therefore attributable in large part to the scoring of untranscribed receptors; their removal renders the ranking receptor-specific. The null pool must additionally be expression-matched, since an unmatched pool yields ρ=0.323 and would incorrectly reject a receptor-specific score (Fig. 3).</w:t>
       </w:r>
     </w:p>
     <w:p>
@@ -1992,7 +1867,7 @@
         <w:t>Figure 3.</w:t>
       </w:r>
       <w:r>
-        <w:t xml:space="preserve"> The expression floor and the two-factor decomposition. (a) Floor audit; 28 interactions (red) never clear the floor in any tumor type. (b) Two-factor decomposition. Availability is a property of the source and is constant across receivers, so only capacity can explain differences between tumor types.</w:t>
+        <w:t xml:space="preserve"> The expression floor and the two-factor decomposition. (a) Floor audit across all 188 candidate interactions; 28 (red) never clear the floor of 0.005xGAPDH (345.67 RSEM normalized counts) in any of the 30 tumor types, including all four PENK-opioid axes at 4x10-5 to 3x10-3 of GAPDH. (b) Two-factor decomposition of the compatibility score into ligand availability and receiver capacity. Availability is a property of the source and is constant across receivers, so only capacity can explain differences between tumor types.</w:t>
       </w:r>
     </w:p>
     <w:p>
@@ -2020,7 +1895,7 @@
           <w:rFonts w:ascii="Times New Roman" w:hAnsi="Times New Roman"/>
           <w:color w:val="000000"/>
         </w:rPr>
-        <w:t>3.4 Pan-cancer ranking, and how much of it to believe</w:t>
+        <w:t>3.4 Pan-cancer compatibility ranking and its statistical resolution</w:t>
       </w:r>
     </w:p>
     <w:p>
@@ -2046,7 +1921,7 @@
       <w:r>
         <w:drawing>
           <wp:inline xmlns:a="http://schemas.openxmlformats.org/drawingml/2006/main" xmlns:pic="http://schemas.openxmlformats.org/drawingml/2006/picture">
-            <wp:extent cx="5760720" cy="4258269"/>
+            <wp:extent cx="5760720" cy="4453890"/>
             <wp:docPr id="4" name="Picture 4"/>
             <wp:cNvGraphicFramePr>
               <a:graphicFrameLocks noChangeAspect="1"/>
@@ -2067,7 +1942,7 @@
                   <pic:spPr>
                     <a:xfrm>
                       <a:off x="0" y="0"/>
-                      <a:ext cx="5760720" cy="4258269"/>
+                      <a:ext cx="5760720" cy="4453890"/>
                     </a:xfrm>
                     <a:prstGeom prst="rect"/>
                   </pic:spPr>
@@ -2089,7 +1964,7 @@
         <w:t>Figure 4.</w:t>
       </w:r>
       <w:r>
-        <w:t xml:space="preserve"> Pan-cancer compatibility ranking against an expression-matched null. (a) Ranking with bootstrap CIs; the 4 blue types beat the matched-random null at p&lt;0.05. (b) The floor is what makes the score receptor-specific.</w:t>
+        <w:t xml:space="preserve"> Pan-cancer compatibility ranking against an expression-matched null. (a) Compatibility score for each of 30 tumor types with 95% bootstrap confidence intervals (400 resamples, seed 20260727); the 4 types shown in blue exceed the expression-decile-matched random null at p&lt;0.05 (UCS 0.003, BRCA 0.010, KIRC 0.013, PAAD 0.033). Ovarian carcinoma ranks second by score but does not pass (p=0.060). Individual positions are not interpretable: the ranking reorders substantially under double-centring (ρ=0.318 against the primary ranking). (b) Mean null correlation under three background constructions, showing that the absolute expression floor rather than the expression matching is what renders the score receptor-specific.</w:t>
       </w:r>
     </w:p>
     <w:p>
@@ -2120,7 +1995,7 @@
           <w:rFonts w:ascii="Times New Roman" w:hAnsi="Times New Roman"/>
           <w:color w:val="000000"/>
         </w:rPr>
-        <w:t>3.6 Receptor expression does not correspond to lineage dependency</w:t>
+        <w:t>3.6 Absence of correspondence between receptor expression and lineage dependency</w:t>
       </w:r>
     </w:p>
     <w:p>
@@ -2130,7 +2005,7 @@
     </w:p>
     <w:p>
       <w:r>
-        <w:t>No receptor is significant after FDR correction (0 of 81, 3 nominal). More pointedly, the receptors on the leading axes are not dependencies anywhere. NPR1 has a pan-lineage mean gene effect of −0.163, and every WNT9A receptor subunit lies between LRP5 (−0.163) and FZD6 (+0.146), with no lineage cell crossing −0.5. The eight receptors that are dependencies (NCL, ITGAV, EGFR, ITGB5, ITGB1, ERBB2, FGFR1, IGF1R) are pan-essential or canonical adhesion and RTK genes whose essentiality is lineage-driven and unrelated to HF ligand availability.</w:t>
+        <w:t>No receptor is significant after FDR correction (0 of 81, 3 nominal; minimum FDR 0.784). Furthermore, the receptors on the highest-ranked axes are not dependencies in any lineage. NPR1 has a pan-lineage mean gene effect of −0.163, and every WNT9A receptor subunit lies between LRP5 (−0.163) and FZD6 (+0.146), with no lineage cell crossing −0.5. The eight receptors that are dependencies (NCL, ITGAV, EGFR, ITGB5, ITGB1, ERBB2, FGFR1, IGF1R) are pan-essential or canonical adhesion and RTK genes whose essentiality is lineage-driven and unrelated to HF ligand availability.</w:t>
       </w:r>
     </w:p>
     <w:p>
@@ -2189,7 +2064,7 @@
         <w:t>Figure 5.</w:t>
       </w:r>
       <w:r>
-        <w:t xml:space="preserve"> Receptor expression and CRISPR dependency. (a) HF-axis receptors cluster at zero gene effect while essential controls sit near −2.4. (b) No receptor survives FDR. (c) Proposed uterine panel.</w:t>
+        <w:t xml:space="preserve"> Receptor expression does not correspond to CRISPR dependency. (a) Mean Chronos gene effect for the 81 floor-passing HF-axis receptors against essential and non-essential controls across 22 DepMap 24Q4 lineages; HF-axis receptors cluster at zero while essential controls sit near -2.4 (RPL3 -2.53, PLK1 -2.69). (b) Correlation between per-lineage gene effect and compatibility score; no receptor survives Benjamini-Hochberg correction (0 of 81, 3 nominal, minimum FDR 0.784). (c) Proposed uterine cell-line panel for a WNT9A-FZD7 test, with 48.7-fold FZD7 separation between the high and low arms.</w:t>
       </w:r>
     </w:p>
     <w:p>
@@ -2295,7 +2170,7 @@
         <w:t>Figure 6.</w:t>
       </w:r>
       <w:r>
-        <w:t xml:space="preserve"> Ligand cardiac specificity and receptor tumor enrichment. (a) Only NPPA and NPPB are cardiac-enriched among 42 HF ligands. (b) NPR1 is depleted in tumor versus adjacent normal in every testable type.</w:t>
+        <w:t xml:space="preserve"> Ligand cardiac specificity and receptor tumor enrichment. (a) Under a rank-based definition (heart rank 1 of 52 GTEx tissues with left-ventricle median at least 5 TPM) only NPPA and NPPB are cardiac-enriched among the 42 HF-upregulated secreted ligands; the criterion is definition-dependent, and a fold-enrichment definition additionally admits AGT (Section 3.7). (b) NPR1, the sole floor-passing receptor for those two ligands, is depleted in tumor relative to unit-matched adjacent normal in all 15 types with at least 10 adjacent normals (median log2FC -1.91, all FDR&lt;0.05, 680 normal samples).</w:t>
       </w:r>
     </w:p>
     <w:p>
@@ -2308,7 +2183,7 @@
           <w:rFonts w:ascii="Times New Roman" w:hAnsi="Times New Roman"/>
           <w:color w:val="000000"/>
         </w:rPr>
-        <w:t>3.8 A falsifiable experiment, despite the negative result</w:t>
+        <w:t>3.8 A falsifiable experimental test derived from the negative result</w:t>
       </w:r>
     </w:p>
     <w:p>
@@ -2326,7 +2201,7 @@
           <w:rFonts w:ascii="Times New Roman" w:hAnsi="Times New Roman"/>
           <w:color w:val="000000"/>
         </w:rPr>
-        <w:t>3.9 Correcting the specificity filter recovers axes, and the recovered axes do not survive</w:t>
+        <w:t>3.9 Correction of the specificity filter and adversarial testing of the recovered axes</w:t>
       </w:r>
     </w:p>
     <w:p>
@@ -2744,7 +2619,7 @@
           <w:rFonts w:ascii="Times New Roman" w:hAnsi="Times New Roman"/>
           <w:color w:val="000000"/>
         </w:rPr>
-        <w:t>The receptor test is not discriminating (Track 1)</w:t>
+        <w:t>Track 1: receiver discrimination</w:t>
       </w:r>
     </w:p>
     <w:p>
@@ -2777,7 +2652,7 @@
           <w:rFonts w:ascii="Times New Roman" w:hAnsi="Times New Roman"/>
           <w:color w:val="000000"/>
         </w:rPr>
-        <w:t>PTN is an injury gene rather than a cardiac gene (Track 2)</w:t>
+        <w:t>Track 2: tissue generality</w:t>
       </w:r>
     </w:p>
     <w:p>
@@ -2846,7 +2721,7 @@
           <w:rFonts w:ascii="Times New Roman" w:hAnsi="Times New Roman"/>
           <w:color w:val="000000"/>
         </w:rPr>
-        <w:t>The measurement the premise requires has never been made (Track 3)</w:t>
+        <w:t>Track 3: literature evidence for a circulating source</w:t>
       </w:r>
     </w:p>
     <w:p>
@@ -2883,16 +2758,13 @@
         <w:t>50</w:t>
       </w:r>
       <w:r>
-        <w:t xml:space="preserve"> in which only 8 of 28 cases had heart failure, in a population where serum PTN is independently raised by cancer, and coronary collateral grade</w:t>
+        <w:t xml:space="preserve"> in which only 8 of 28 cases had heart failure, in a population where serum PTN is independently raised by cancer, and coronary collateral grade.</w:t>
       </w:r>
       <w:r>
         <w:rPr>
           <w:vertAlign w:val="superscript"/>
         </w:rPr>
         <w:t>51</w:t>
-      </w:r>
-      <w:r>
-        <w:t>.</w:t>
       </w:r>
     </w:p>
     <w:p>
@@ -2931,7 +2803,7 @@
       <w:r>
         <w:drawing>
           <wp:inline xmlns:a="http://schemas.openxmlformats.org/drawingml/2006/main" xmlns:pic="http://schemas.openxmlformats.org/drawingml/2006/picture">
-            <wp:extent cx="5760720" cy="4321251"/>
+            <wp:extent cx="5760720" cy="4836972"/>
             <wp:docPr id="7" name="Picture 7"/>
             <wp:cNvGraphicFramePr>
               <a:graphicFrameLocks noChangeAspect="1"/>
@@ -2952,7 +2824,7 @@
                   <pic:spPr>
                     <a:xfrm>
                       <a:off x="0" y="0"/>
-                      <a:ext cx="5760720" cy="4321251"/>
+                      <a:ext cx="5760720" cy="4836972"/>
                     </a:xfrm>
                     <a:prstGeom prst="rect"/>
                   </pic:spPr>
@@ -2974,7 +2846,7 @@
         <w:t>Figure 7.</w:t>
       </w:r>
       <w:r>
-        <w:t xml:space="preserve"> Cardiac specificity re-scored against failure induction. (a) Sequential attrition across the three pre-specified criteria; 3 of 51 ligands clear all three. (b) Which criteria each ligand fails, showing failure induction as the binding constraint. (c) Induction magnitude against baseline heart rank; PTN clears the induction and abundance criteria but sits 23rd of 52 tissues at baseline. (d) The seven surviving axes, all with PTN as ligand, by number of tumor types in which the receptor is enriched versus matched adjacent normal. Ligand criteria are computed within single datasets only; the receptor side is unchanged from Section 3.7. n = 51 ligands, 146 axes.</w:t>
+        <w:t xml:space="preserve"> Cardiac specificity re-scored against failure induction. (a) Sequential attrition across the three pre-specified criteria; 3 of 51 ligands clear all three. The third criterion is A3, requiring the heart to rank in the upper half of the 52 GTEx tissues. (b) Combinations of criteria failed across the same 51 ligands; the 3 ligands failing none are NPPA, NPPB and PTN. (c) Induction magnitude, taken as the minimum log2 fold change across the two cohorts, against baseline cardiac rank; the four ligands clearing both induction and abundance are shown in red, of which MDK is excluded at rank 36 while PTN is retained at rank 23. (d) The surviving pleiotrophin axes scored at complex level under the minimum-subunit rule, by number of tumor types in which the receptor is enriched relative to matched adjacent normal. Ligand criteria are computed within single datasets only; the receptor side is unchanged from Section 3.7. n = 51 ligands, 146 axes.</w:t>
       </w:r>
     </w:p>
     <w:p>
@@ -3002,7 +2874,7 @@
     </w:p>
     <w:p>
       <w:r>
-        <w:t>Two findings qualify Section 3.1. The shared platform inflated the apparent agreement: across all 10 cohort pairs, the 4 same-technology pairs have median concordance 0.918 and median ρ=0.722 among genes significant in both, against 0.745 and 0.545 for the 6 cross-technology pairs. The original pair sat at 0.881 and 0.759, inside the same-technology range. The concordance figure quoted in Section 3.1 is therefore about 0.17 units optimistic as an estimate of platform-independent agreement, and should be read as a within-technology number.</w:t>
+        <w:t>Two aspects of the cross-platform comparison qualify the replication reported in Section 3.1. The shared sequencing platform inflated the apparent agreement: across all 10 cohort pairs, the 4 same-technology pairs have median concordance 0.918 and median ρ=0.722 among genes significant in both, against 0.745 and 0.545 for the 6 cross-technology pairs. The original pair sat at 0.881 and 0.759, inside the same-technology range. The concordance figure quoted in Section 3.1 is therefore about 0.17 units optimistic as an estimate of platform-independent agreement, and should be read as a within-technology number.</w:t>
       </w:r>
     </w:p>
     <w:p>
@@ -3088,7 +2960,35 @@
           <w:rFonts w:ascii="Times New Roman" w:hAnsi="Times New Roman"/>
           <w:color w:val="000000"/>
         </w:rPr>
-        <w:t>3.11 Protein-level test of the receptor result</w:t>
+        <w:t>3.11 The natriuretic peptide receptor family</w:t>
+      </w:r>
+    </w:p>
+    <w:p>
+      <w:r>
+        <w:t>Claiming NPR1 as the sole floor-passing receptor for NPPA and NPPB invites the question of what the other two natriuretic peptide receptors do, so all three were tested. The answer has two parts, one about the database and one about the data.</w:t>
+      </w:r>
+    </w:p>
+    <w:p>
+      <w:r>
+        <w:t>The database part is a scope limitation. CellChatDB pairs NPR2 with NPPC only and NPR3 with OSTN only, and neither NPPC nor OSTN is among the ligands induced in the failing ventricle. Within the curated interaction set, therefore, NPR1 is the only receptor reachable from NPPA or NPPB, and the claim is true as stated. It is true of the database rather than of receptor pharmacology: NPR3 binds ANP and BNP as a clearance receptor in vivo, and that binding is not recorded in CellChatDB. A curation gap of this kind cannot be detected from within the screen, which is a general limitation of interaction-database methods rather than a property of this dataset.</w:t>
+      </w:r>
+    </w:p>
+    <w:p>
+      <w:r>
+        <w:t>The data part removes the objection independently of the curation. Streaming NPR1, NPR2 and NPR3 from the PanCanAtlas matrix across 6,888 primary tumors and 698 adjacent normals in the 15 unit-matched types gives tumor-median expression of 125, 148 and 29 RSEM respectively, against a floor of 346; NPR1 and NPR2 clear the floor in 2 types each and NPR3 in 1. All three run in the depleted direction: median log2 fold change against matched adjacent normal is -1.91 for NPR1, -0.60 for NPR2 and -1.27 for NPR3, with significant depletion (Mann-Whitney, BH-FDR &lt; 0.05) in 15, 8 and 13 of 15 types. Across 45 receptor-by-type comparisons exactly one is significantly enriched, NPR2 in papillary renal cell carcinoma (log2FC +0.48, FDR = 0.001), whose only annotated ligand NPPC is not induced in the failing heart. Extending the receptor arm to the full family therefore does not recover a candidate axis, and the re-streamed NPR1 value reproduces the -1.91 reported in Section 3.7 from an independent extraction.</w:t>
+      </w:r>
+    </w:p>
+    <w:p>
+      <w:pPr>
+        <w:pStyle w:val="Heading3"/>
+        <w:spacing w:line="240" w:lineRule="auto"/>
+      </w:pPr>
+      <w:r>
+        <w:rPr>
+          <w:rFonts w:ascii="Times New Roman" w:hAnsi="Times New Roman"/>
+          <w:color w:val="000000"/>
+        </w:rPr>
+        <w:t>3.12 Protein-level test of the receptor result</w:t>
       </w:r>
     </w:p>
     <w:p>
@@ -3158,12 +3058,12 @@
           <w:rFonts w:ascii="Times New Roman" w:hAnsi="Times New Roman"/>
           <w:color w:val="000000"/>
         </w:rPr>
-        <w:t>3.12 A named mediator from the review literature runs in the opposite direction</w:t>
-      </w:r>
-    </w:p>
-    <w:p>
-      <w:r>
-        <w:t>A 2024 review of this field</w:t>
+        <w:t>3.13 Directional discordance of a mediator nominated in the review literature</w:t>
+      </w:r>
+    </w:p>
+    <w:p>
+      <w:r>
+        <w:t>A 2024 review of this field by Seuthe et al.</w:t>
       </w:r>
       <w:r>
         <w:rPr>
@@ -3195,7 +3095,7 @@
     </w:p>
     <w:p>
       <w:r>
-        <w:t>The discrepancy is most likely a species difference rather than a contradiction of the mouse work, since the induction was demonstrated in murine myocardium and in mouse plasma, whereas these are human explanted ventricles from patients with established end-stage disease, many on mechanical support. It nonetheless bears directly on the scope of the screen. The one mediator the review literature names most confidently is one this design could not have recovered, for two independent reasons, and that is worth stating rather than leaving to a reader who knows the field.</w:t>
+        <w:t>The discrepancy is most likely a species difference rather than a contradiction of the mouse work, since the induction was demonstrated in murine myocardium and in mouse plasma, whereas these are human explanted ventricles from patients with established end-stage disease, many on mechanical support. It nonetheless bears directly on the scope of the screen. The one mediator the review literature names most confidently is one this design could not have recovered, for two independent reasons, and this is stated explicitly rather than left to inference.</w:t>
       </w:r>
     </w:p>
     <w:p>
@@ -3231,12 +3131,12 @@
           <w:rFonts w:ascii="Times New Roman" w:hAnsi="Times New Roman"/>
           <w:color w:val="000000"/>
         </w:rPr>
-        <w:t>3.13 The closest human study nominates different ligands, and they fail different gates</w:t>
-      </w:r>
-    </w:p>
-    <w:p>
-      <w:r>
-        <w:t>A 2025 European Heart Journal report is the closest human work to this screen and reaches a partially different answer, so its nominated ligands were run through the gates used here rather than discussed in the abstract</w:t>
+        <w:t>3.14 Comparison with the closest human study</w:t>
+      </w:r>
+    </w:p>
+    <w:p>
+      <w:r>
+        <w:t>A 2025 conference abstract by Caller et al.</w:t>
       </w:r>
       <w:r>
         <w:rPr>
@@ -3245,7 +3145,7 @@
         <w:t>56</w:t>
       </w:r>
       <w:r>
-        <w:t>. It used single-cell data from ischemic and failing human hearts with NicheNet, implicated cardiac mesenchymal stromal cells as the source, nominated POSTN, NGF and PDGF-family ligands, and reported increased lung-cancer-cell proliferation in response to conditioned medium.</w:t>
+        <w:t xml:space="preserve"> is the closest human work to this screen and reaches a partially different answer, so its nominated ligands were run through the gates used here rather than discussed in prose. Because that report is a meeting abstract rather than a full paper, its methods are available only in summary, and the comparison below is with the ligands it nominates rather than with its analysis. It used single-cell data from ischemic and failing human hearts with NicheNet, implicated cardiac mesenchymal stromal cells as the source, nominated POSTN, NGF and PDGF-family ligands, and reported increased lung-cancer-cell proliferation in response to conditioned medium.</w:t>
       </w:r>
     </w:p>
     <w:p>
@@ -3308,7 +3208,7 @@
           <w:rFonts w:ascii="Times New Roman" w:hAnsi="Times New Roman"/>
           <w:color w:val="000000"/>
         </w:rPr>
-        <w:t>4.1 Where the hypothesis fails, and why the location matters</w:t>
+        <w:t>4.1 Location of the failure within the two-factor model</w:t>
       </w:r>
     </w:p>
     <w:p>
@@ -3331,7 +3231,7 @@
           <w:rFonts w:ascii="Times New Roman" w:hAnsi="Times New Roman"/>
           <w:color w:val="000000"/>
         </w:rPr>
-        <w:t>4.2 Three requirements that outlive this dataset, and the form they were written in</w:t>
+        <w:t>4.2 Generalizable methodological requirements and their implementation</w:t>
       </w:r>
     </w:p>
     <w:p>
@@ -3356,7 +3256,7 @@
     </w:p>
     <w:p>
       <w:r>
-        <w:t>The sequence in Section 3.9, comprising a negative result, a filter identified as capable of having caused it, a correction that recovers hits, and a base-rate check that withdraws them, is generic enough that others will repeat it. That is the argument for writing the three requirements where they bind. Stated as prose here, they would be inherited by the next study as text, and a study that omits the floor would produce a result indistinguishable in form from one that honors it. Stated as assertions in the scoring skill, omitting the floor produces an exception naming the offending gene.</w:t>
+        <w:t>The sequence in Section 3.9, comprising a negative result, a filter identified as capable of having caused it, a correction that recovers hits, and a base-rate check that withdraws them, is generic enough that others will repeat it. This is the rationale for encoding the three requirements at the point of enforcement. Stated as prose here, they would be inherited by the next study as text, and a study that omits the floor would produce a result indistinguishable in form from one that honors it. Stated as assertions in the scoring skill, omitting the floor produces an exception naming the offending gene.</w:t>
       </w:r>
     </w:p>
     <w:p>
@@ -3392,7 +3292,7 @@
           <w:rFonts w:ascii="Times New Roman" w:hAnsi="Times New Roman"/>
           <w:color w:val="000000"/>
         </w:rPr>
-        <w:t>4.4 What would decide the question</w:t>
+        <w:t>4.4 Measurements required to resolve the question</w:t>
       </w:r>
     </w:p>
     <w:p>
@@ -3426,7 +3326,7 @@
         <w:t>Transcript-only.</w:t>
       </w:r>
       <w:r>
-        <w:t xml:space="preserve"> Every measurement is mRNA. An endocrine mechanism requires circulating protein, and cardiac transcript induction need not produce elevated plasma ligand. Cell-specific knockout of CCN2 showed that a secreted cardiac factor can act autocrine on neighbouring fibroblasts rather than distally</w:t>
+        <w:t xml:space="preserve"> Every measurement is mRNA. An endocrine mechanism requires circulating protein, and cardiac transcript induction need not produce elevated plasma ligand. Cell-specific knockout of CCN2 showed that a secreted cardiac factor can act autocrine on neighbouring fibroblasts rather than distally.</w:t>
       </w:r>
       <w:r>
         <w:rPr>
@@ -3434,9 +3334,6 @@
         </w:rPr>
         <w:t>52</w:t>
       </w:r>
-      <w:r>
-        <w:t>.</w:t>
-      </w:r>
     </w:p>
     <w:p>
       <w:r>
@@ -3454,10 +3351,10 @@
         <w:rPr>
           <w:b/>
         </w:rPr>
-        <w:t>Protein-level coverage, not protein-level agreement.</w:t>
-      </w:r>
-      <w:r>
-        <w:t xml:space="preserve"> The proteomic test of NPR1 was abandoned as underpowered rather than passed or failed (Section 3.11). NPR1 is absent from two of eight CPTAC gene indices and below a 60% per-arm coverage floor in three more, and absence of detection in a mass-spectrometry matrix is not evidence of absent protein. The breast study is untestable for a different reason: all its adjacent normals sit in normal-only plexes, so batch is perfectly confounded with the comparison.</w:t>
+        <w:t>Protein-level coverage.</w:t>
+      </w:r>
+      <w:r>
+        <w:t xml:space="preserve"> The proteomic test of NPR1 was abandoned as underpowered rather than passed or failed (Section 3.12). NPR1 is absent from two of eight CPTAC gene indices and below a 60% per-arm coverage floor in three more, and absence of detection in a mass-spectrometry matrix is not evidence of absent protein. The breast study is untestable for a different reason: all its adjacent normals sit in normal-only plexes, so batch is perfectly confounded with the comparison.</w:t>
       </w:r>
     </w:p>
     <w:p>
@@ -3465,7 +3362,7 @@
         <w:rPr>
           <w:b/>
         </w:rPr>
-        <w:t>Ambiguous probes were dropped, not resolved.</w:t>
+        <w:t>Ambiguous probe mappings.</w:t>
       </w:r>
       <w:r>
         <w:t xml:space="preserve"> On the array platforms, 1,223 of 22,283 probes on GPL96 (5.5%) and 2,354 of 33,297 on GPL11532 (7.1%) map to more than one gene symbol. These were excluded rather than assigned to their first listed gene, which loses a small fraction of measurable genes (2.6% of signature symbols on GPL96, 4.9% on GPL11532) but avoids attributing the signal of a probe to an arbitrary one of its targets. No canonical marker is affected.</w:t>
@@ -3490,7 +3387,7 @@
         <w:t>Method heterogeneity across cohorts.</w:t>
       </w:r>
       <w:r>
-        <w:t xml:space="preserve"> GSE116250 provides RPKM and GSE141910 log-scale normalized counts, so cross-cohort effect sizes are not strictly comparable, and we rely on rank concordance rather than pooled magnitudes. The empirical-Bayes moderated t is our own implementation of a limma-trend equivalent rather than a call into limma</w:t>
+        <w:t xml:space="preserve"> GSE116250 provides RPKM and GSE141910 log-scale normalized counts, so cross-cohort effect sizes are not strictly comparable, and we rely on rank concordance rather than pooled magnitudes. The empirical-Bayes moderated t is our own implementation of a limma-trend equivalent rather than a call into limma.</w:t>
       </w:r>
       <w:r>
         <w:rPr>
@@ -3498,9 +3395,6 @@
         </w:rPr>
         <w:t>42</w:t>
       </w:r>
-      <w:r>
-        <w:t>.</w:t>
-      </w:r>
     </w:p>
     <w:p>
       <w:r>
@@ -3551,7 +3445,7 @@
         <w:rPr>
           <w:b/>
         </w:rPr>
-        <w:t>Induction is not a systemic source.</w:t>
+        <w:t>Induction as distinct from systemic release.</w:t>
       </w:r>
       <w:r>
         <w:t xml:space="preserve"> The corrected specificity criterion in Section 3.9 admits ligands on induction magnitude without establishing that the failing heart dominates the circulating pool. Converting tissue mRNA into a circulating contribution requires parameters unavailable for these ligands, so that analysis was pre-emptively excluded rather than attempted with fabricated values.</w:t>
@@ -3562,7 +3456,7 @@
         <w:rPr>
           <w:b/>
         </w:rPr>
-        <w:t>A relaxed criterion needs a base-rate guard.</w:t>
+        <w:t>Base-rate guard for relaxed criteria.</w:t>
       </w:r>
       <w:r>
         <w:t xml:space="preserve"> The seven-axis result was recovered by relaxing one criterion and withdrawn by measuring the base rate of the criterion it was recovered against. Any screen that loosens a filter to recover hits should report the rate at which the unmodified half of the test passes; ours was 74%.</w:t>
@@ -3573,10 +3467,10 @@
         <w:rPr>
           <w:b/>
         </w:rPr>
-        <w:t>Bulk induction may not be per-cell induction.</w:t>
-      </w:r>
-      <w:r>
-        <w:t xml:space="preserve"> Cardiac PTN induction (logFC 1.50, replicated across two cohorts) does not reproduce as per-cell induction in two single-nucleus atlases. Bulk differential expression in a tissue whose composition changes with disease can reflect cell-proportion shifts rather than per-cell regulation, and the ligand-availability term of this screen is computed from bulk for every ligand, not only PTN.</w:t>
+        <w:t>Bulk versus per-cell induction.</w:t>
+      </w:r>
+      <w:r>
+        <w:t xml:space="preserve"> Cardiac PTN induction (logFC 1.50, replicated across two cohorts) does not reproduce as per-cell induction in two single-nucleus atlases. Bulk differential expression in a tissue whose composition changes with disease can reflect cell-proportion shifts rather than per-cell regulation, and the ligand-availability term of this screen is computed from bulk for every ligand, not only PTN. The receptor side carries the same exposure: tumor purity varies by several-fold across the types scored here and was not adjusted for, so a receptor's apparent depletion or enrichment against adjacent normal is compatible with a shift in malignant-cell fraction as well as with regulation, and purity remains an untested alternative explanation for the receptor result.</w:t>
       </w:r>
     </w:p>
     <w:p>
@@ -3600,22 +3494,17 @@
           <w:rFonts w:ascii="Times New Roman" w:hAnsi="Times New Roman"/>
           <w:color w:val="000000"/>
         </w:rPr>
-        <w:t>4.6 What the model decided, and what the code enforces</w:t>
-      </w:r>
-    </w:p>
-    <w:p>
-      <w:r>
-        <w:t>Describing this pipeline as agentic invites a fair question: how much of the result depends on the language model that assembled it, and would a different or cheaper model have produced something else. The answer follows from where the work sits. None of the 4,858 lines contains a call to a language model, an API key or a platform function, so given the same inputs they return the same numbers whichever agent invoked them, and every figure and table here is output of that layer.</w:t>
-      </w:r>
-    </w:p>
-    <w:p>
-      <w:r>
-        <w:t>The contribution of the model was orchestration and judgment: deciding that ligand distinctiveness and receptor abundance are the two factors worth scoring, recognising that untranscribed receptors were inflating the null and that a floor was therefore required, choosing an expression-matched rather than a naive background, and requiring a base rate before the hits recovered by a relaxed filter could be believed. Those are the decisions this paper argues about. Once made, each was written into a module as an assertion, at which point it ceased to be a judgment and became a property of the software.</w:t>
-      </w:r>
-    </w:p>
-    <w:p>
-      <w:r>
-        <w:t>That division has a practical consequence for cost. The expensive capability is needed at the design stage, where the number of decisions is small, whereas the deterministic layer, where essentially all the compute goes, needs no model at all. A cheaper or smaller model driving these skills inherits the same guardrails, because a below-floor receptor raises an error regardless of which agent supplied the arguments. What a weaker model risks is not a corrupted number but a worse experiment: a poorly chosen comparison, or a filter relaxed without checking its base rate. Running the modules is cheap and safe; deciding what to run is where model quality matters, and it is also where a mistake is hardest to detect afterwards.</w:t>
+        <w:t>4.6 Reuse beyond this question</w:t>
+      </w:r>
+    </w:p>
+    <w:p>
+      <w:r>
+        <w:t>The same six skills apply wherever the secreted output of a source tissue is scored against receiver contexts, including any organ-crosstalk screen, any secretome-to-receptor ranking, and any compatibility score across many tissues or cell lines. Nothing in the scoring module depends on the source being heart or the receivers being tumors, since it consumes a feature matrix and a vector of source-derived weights.</w:t>
+      </w:r>
+    </w:p>
+    <w:p>
+      <w:r>
+        <w:t>What does not transfer automatically is the threshold. The floor is calibrated as a fraction of GAPDH in RSEM units, and a study on a different platform must recalibrate it rather than inherit the number, since the assertion enforces that a floor exists and was applied rather than that 0.005×GAPDH is correct everywhere. The limit of the mechanism is therefore that it renders a requirement unavoidable without making its parameterisation universal.</w:t>
       </w:r>
     </w:p>
     <w:p>
@@ -3628,45 +3517,27 @@
           <w:rFonts w:ascii="Times New Roman" w:hAnsi="Times New Roman"/>
           <w:color w:val="000000"/>
         </w:rPr>
-        <w:t>4.7 Reuse beyond this question</w:t>
-      </w:r>
-    </w:p>
-    <w:p>
-      <w:r>
-        <w:t>The same six skills apply wherever the secreted output of a source tissue is scored against receiver contexts, including any organ-crosstalk screen, any secretome-to-receptor ranking, and any compatibility score across many tissues or cell lines. Nothing in the scoring module depends on the source being heart or the receivers being tumors, since it consumes a feature matrix and a vector of source-derived weights.</w:t>
-      </w:r>
-    </w:p>
-    <w:p>
-      <w:r>
-        <w:t>What does not transfer automatically is the threshold. The floor is calibrated as a fraction of GAPDH in RSEM units, and a study on a different platform must recalibrate it rather than inherit the number, since the assertion enforces that a floor exists and was applied rather than that 0.005×GAPDH is correct everywhere. That is the honest limit of the mechanism: it makes a requirement unavoidable, not universally parameterised.</w:t>
-      </w:r>
-    </w:p>
-    <w:p>
-      <w:pPr>
-        <w:pStyle w:val="Heading3"/>
-        <w:spacing w:line="240" w:lineRule="auto"/>
-      </w:pPr>
-      <w:r>
-        <w:rPr>
-          <w:rFonts w:ascii="Times New Roman" w:hAnsi="Times New Roman"/>
-          <w:color w:val="000000"/>
-        </w:rPr>
-        <w:t>4.8 What the multi-agent split bought, and what it cost</w:t>
-      </w:r>
-    </w:p>
-    <w:p>
-      <w:r>
-        <w:t>Splitting the work bought three things, and the third changed a result. These are observations from one execution, not a controlled comparison: no single-agent baseline, no scripted-workflow baseline and no context-isolation ablation were run, so what follows describes what this configuration did and not what an alternative would have failed to do.</w:t>
-      </w:r>
-    </w:p>
-    <w:p>
-      <w:r>
-        <w:t>The first is throughput on independent tracks. The four wave-1 acquisition tracks share no inputs and ran concurrently; serially they would have consumed the sum of their durations rather than the maximum.</w:t>
-      </w:r>
-    </w:p>
-    <w:p>
-      <w:r>
-        <w:t>The second is context isolation as a correctness property rather than an efficiency one. Each sub-agent received a task statement and a summary, never the conversation of the orchestrator, so it could not inherit an assumption formed earlier. This is what made the wave-4 audits usable, since tracks were dispatched specifically to re-derive claims the orchestrator had already written into the manuscript, working from the result tables rather than from its prose, and they found errors. The adjacent-normal sample count was reported as 710 where the table sums to 680, because 710 counts samples before the minimum-normals filter. The number of tumor types in which NPR1 fails the expression floor was reported as 26 of 30 where the column gives 24. One survival claim mixed units, stating zero of 160 when the table holds 146 subunit-level axes and 160 is the complex-level count. A review track separately found a pre-specification justifying its matched-null requirement by citing the expression-floor contrast (ρ=0.363 against 0.107) rather than the matching contrast (ρ=0.323), which is a reasoning error rather than a typographical one. None of these changes a conclusion, and that is the point: they are the class of error that survives self-review, because an agent auditing its own prose in its own context has already been persuaded by it.</w:t>
+        <w:t>4.7 Effects and costs of the multi-agent execution model</w:t>
+      </w:r>
+    </w:p>
+    <w:p>
+      <w:r>
+        <w:t>Three effects of partitioning the work were observed, the third of which altered a reported result. These are observations from a single execution rather than a controlled comparison: no single-agent baseline, no scripted-workflow baseline and no context-isolation ablation were run, so what follows describes what this configuration did and not what an alternative would have failed to do.</w:t>
+      </w:r>
+    </w:p>
+    <w:p>
+      <w:r>
+        <w:t>Where the work sits determines how much of it depends on the language model. None of the 4,858 lines contains a call to a language model, an API key or a platform function, so given the same inputs they return the same numbers whichever agent invoked them, and every figure and table here is output of that layer. The model contributed orchestration and judgment: choosing ligand distinctiveness and receptor abundance as the two factors, recognizing that an unfloored score was measuring the expression axis, and deciding that a recovered axis had to be tested against a ligand-free base rate. Those choices are reported so they can be disputed, and a different model making different ones would produce a different paper from the same modules.</w:t>
+      </w:r>
+    </w:p>
+    <w:p>
+      <w:r>
+        <w:t>The first effect was increased throughput on independent tracks. The four wave-1 acquisition tracks share no inputs and ran concurrently; serially they would have consumed the sum of their durations rather than the maximum.</w:t>
+      </w:r>
+    </w:p>
+    <w:p>
+      <w:r>
+        <w:t>The second is context isolation as a correctness property rather than an efficiency one. Each sub-agent received a task statement and a summary, never the conversation of the orchestrator, so it could not inherit an assumption formed earlier. This is what made the wave-4 audits usable, since tracks were dispatched specifically to re-derive claims the orchestrator had already written into the manuscript, working from the result tables rather than from its prose, and they found errors. The adjacent-normal sample count was reported as 710 where the table sums to 680, because 710 counts samples before the minimum-normals filter. The number of tumor types in which NPR1 fails the expression floor was reported as 26 of 30 where the column gives 24. One survival claim mixed units, stating zero of 160 when the table holds 146 subunit-level axes and 160 is the complex-level count. A review track separately found a pre-specification justifying its matched-null requirement by citing the expression-floor contrast (ρ=0.363 against 0.107) rather than the matching contrast (ρ=0.323), which is a reasoning error rather than a typographical one. None of these alters a conclusion, which is the relevant observation: they represent the class of error that survives self-review, because an agent auditing its own prose in its own context has already been persuaded by it.</w:t>
       </w:r>
     </w:p>
     <w:p>
@@ -3704,12 +3575,12 @@
     </w:p>
     <w:p>
       <w:r>
-        <w:t>The hypothesis is not refuted in general. It remains tenable in the weaker form that heart failure raises circulating concentrations of factors secreted by many tissues, which would require neither a cardiac-specific ligand nor a tumor-specific receptor. Distinguishing that from the specific form tested here requires plasma measurements in heart-failure patients, and for pleiotrophin, the strongest candidate this screen produced, such measurements do not exist. Tumor proteomics does not substitute, since it measures the receiver rather than the circulating signal. The screen also cannot recover a mediator that acts without a curated cognate receptor, is regulated in the opposite direction in human end-stage disease than in the mouse model, or acts through protease activity rather than receptor binding, which is the case of SerpinA3 (Section 3.12). The negative applies to receptor-mediated signaling by ligands induced in the failing human ventricle rather than to secreted mediators in general.</w:t>
-      </w:r>
-    </w:p>
-    <w:p>
-      <w:r>
-        <w:t>What we would hand to the next group is not the negative but the instrument. The three requirements of Section 4.2 were each discovered as an error this pipeline made, and each now exists as an assertion inside a skill rather than as a paragraph here. That is the difference the paper argues for: a study built on the scoring module cannot omit the expression floor or substitute an unmatched null without raising an error that names the offending gene, whereas a study inheriting the same three findings as prose can omit all of them and produce output that looks correct.</w:t>
+        <w:t>The hypothesis is not refuted in general. It remains tenable in the weaker form that heart failure raises circulating concentrations of factors secreted by many tissues, which would require neither a cardiac-specific ligand nor a tumor-specific receptor. Distinguishing that from the specific form tested here requires plasma measurements in heart-failure patients, and for pleiotrophin, the strongest candidate this screen produced, such measurements do not exist. Tumor proteomics does not substitute, since it measures the receiver rather than the circulating signal. The screen also cannot recover a mediator that acts without a curated cognate receptor, is regulated in the opposite direction in human end-stage disease than in the mouse model, or acts through protease activity rather than receptor binding, which is the case of SerpinA3 (Section 3.13). The negative applies to receptor-mediated signaling by ligands induced in the failing human ventricle rather than to secreted mediators in general.</w:t>
+      </w:r>
+    </w:p>
+    <w:p>
+      <w:r>
+        <w:t>The transferable output of this study is the instrument rather than the negative result itself. The three requirements of Section 4.2 were each discovered as an error this pipeline made, and each now exists as an assertion inside a skill rather than as a paragraph here. The distinction is as follows: a study built on the scoring module cannot omit the expression floor or substitute an unmatched null without raising an error that names the offending gene, whereas a study inheriting the same three findings as prose can omit all of them and produce output that looks correct.</w:t>
       </w:r>
     </w:p>
     <w:p>
@@ -3727,12 +3598,25 @@
           <w:rFonts w:ascii="Times New Roman" w:hAnsi="Times New Roman"/>
           <w:color w:val="000000"/>
         </w:rPr>
-        <w:t>6. Future directions: the architecture as radiology infrastructure</w:t>
-      </w:r>
-    </w:p>
-    <w:p>
-      <w:r>
-        <w:t>The screen reported here is molecular, and the reason it belongs in a radiology venue is not the biology but the instrument. What was built is a way of writing methodological requirements so that an autonomous agent cannot skip them, and radiology research has the same problem this screen had, in a more acute form.</w:t>
+        <w:t>6. Future directions</w:t>
+      </w:r>
+    </w:p>
+    <w:p>
+      <w:pPr>
+        <w:pStyle w:val="Heading3"/>
+        <w:spacing w:line="240" w:lineRule="auto"/>
+      </w:pPr>
+      <w:r>
+        <w:rPr>
+          <w:rFonts w:ascii="Times New Roman" w:hAnsi="Times New Roman"/>
+          <w:color w:val="000000"/>
+        </w:rPr>
+        <w:t>6.1 What would make this a clinical tool</w:t>
+      </w:r>
+    </w:p>
+    <w:p>
+      <w:r>
+        <w:t>The screen reported here answers a question about tissue transcripts, and a clinical instrument would have to answer a question about patients. Three measurements separate the two, and each is obtainable with existing technology rather than new biology.</w:t>
       </w:r>
     </w:p>
     <w:p>
@@ -3740,10 +3624,10 @@
         <w:rPr>
           <w:b/>
         </w:rPr>
-        <w:t>Why the transfer is not incidental.</w:t>
-      </w:r>
-      <w:r>
-        <w:t xml:space="preserve"> The failure mode this pipeline was designed against is the one that produced its own two corrections: a score that looked receptor-specific but was reproduced by random receptor sets, and a source criterion that answered a subtly different question than the one asked. Neither error announced itself. Both were caught by a check that halted execution, and both are now assertions inside a reusable module rather than sentences in a methods section. Imaging analysis is dense with the same class of error. A radiomic feature that tracks scanner or acquisition protocol rather than biology, a segmentation model evaluated on slices from patients also present in training, a batch effect between sites read as a phenotype: each produces a confident number, each survives review of the prose, and none is visible in the output. The requirement that would catch it is usually known and usually written as advice. Written as advice, it is optional for the next study; written as an assertion, it is not.</w:t>
+        <w:t>A circulating measurement, not a tissue one.</w:t>
+      </w:r>
+      <w:r>
+        <w:t xml:space="preserve"> The endocrine premise requires the concentration a tumor is exposed to, which is a plasma quantity. For the recovered ligand that measurement has never been made in a heart-failure cohort against controls (Section 4.4), and no reanalysis of expression data substitutes for it: converting tissue mRNA into a circulating contribution requires translation efficiency, secretion rate, clearance and volume of distribution, none of which this design observes. A single targeted immunoassay in banked plasma from an existing heart-failure cohort would settle whether the ligand arm of the hypothesis has a basis, and would cost less than any of the analyses reported here.</w:t>
       </w:r>
     </w:p>
     <w:p>
@@ -3751,10 +3635,10 @@
         <w:rPr>
           <w:b/>
         </w:rPr>
-        <w:t>What a radiology skill would contain.</w:t>
-      </w:r>
-      <w:r>
-        <w:t xml:space="preserve"> The six modules here follow one pattern: a documentation file an agent reads to decide whether the procedure fits its task, and a Python module that executes it with the correctness requirements compiled in. A radiomics-extraction skill on that pattern would carry the analogues of the two guardrails that proved load-bearing in this study. The expression floor becomes a signal floor, refusing to compute texture statistics on regions below a stated signal-to-noise threshold, because a feature computed on noise still yields a number and still enters a model. The expression-matched null becomes an acquisition-matched null, requiring that any claimed association be tested against features drawn from images matched on scanner, protocol and slice thickness rather than against an unmatched pool, since an unmatched background was precisely what inflated the apparent specificity here. Neither is a novel methodological idea. The contribution is the form: a requirement that halts the run cannot be inadvertently omitted by the next group, whichever agent or person operates the pipeline.</w:t>
+        <w:t>A continuous exposure, not a diagnostic label.</w:t>
+      </w:r>
+      <w:r>
+        <w:t xml:space="preserve"> Cases here were failing versus non-failing explanted ventricles, which collapses a continuum onto a binary. If a ligand's release scales with fibrotic burden or wall stress rather than with a diagnostic category, that contrast is the wrong estimator and attenuates a real signal toward the null. The natriuretic peptides make this concrete: NPPA and NPPB are clinically graded biomarkers whose plasma concentration tracks filling pressure across orders of magnitude, so scoring them as present-or-absent in tissue discards the axis on which they carry information. Cardiac MRI indices of fibrosis, NYHA class, ejection fraction and natriuretic-peptide concentration are all recorded routinely in cardiology cohorts and any of them would serve as a graded exposure.</w:t>
       </w:r>
     </w:p>
     <w:p>
@@ -3762,10 +3646,84 @@
         <w:rPr>
           <w:b/>
         </w:rPr>
-        <w:t>Multi-agent execution and where it needs evidence.</w:t>
-      </w:r>
-      <w:r>
-        <w:t xml:space="preserve"> Section 4.8 reports what the split across 23 sub-agents did in this study and states plainly what it did not test. That gap is itself a radiology-relevant research direction, and a well-posed one: an imaging task with a known ground truth is a better testbed for comparing a single-agent pipeline, a scripted workflow and an isolated multi-agent fleet than a screen whose answer is a negative. Segmentation against expert contours, or detection against adjudicated labels, would let the comparison this paper could not run be run properly, measuring not only accuracy but the rate at which each configuration commits and then propagates a methodological error. The delegation record released here (</w:t>
+        <w:t>Receiver-cell identity, not bulk tissue.</w:t>
+      </w:r>
+      <w:r>
+        <w:t xml:space="preserve"> The receptor arm used bulk expression that mixes malignant, stromal, immune and endothelial compartments. A receptor enriched in bulk tissue but confined to stroma does not support a tumor-cell-intrinsic claim. Single-cell or spatial data on the receiver side would test directly what this design can only infer, and TCGA carries diagnostic whole-slide images for most of the tumors scored here.</w:t>
+      </w:r>
+    </w:p>
+    <w:p>
+      <w:r>
+        <w:t>Until those three exist, a compatibility score of this kind is a hypothesis-generating filter and not a clinical decision aid, and it should be described as one. Its immediate clinical value is negative and still useful: it says which axes are not worth taking into a validation cohort. Screens are cheap to run and cheap to believe, and in a translational chain the alternative to an early withdrawal is expensive, since a target that survives to an animal model or a trial before its base rate is computed consumes resources that a pre-specified criterion would have saved.</w:t>
+      </w:r>
+    </w:p>
+    <w:p>
+      <w:pPr>
+        <w:pStyle w:val="Heading3"/>
+        <w:spacing w:line="240" w:lineRule="auto"/>
+      </w:pPr>
+      <w:r>
+        <w:rPr>
+          <w:rFonts w:ascii="Times New Roman" w:hAnsi="Times New Roman"/>
+          <w:color w:val="000000"/>
+        </w:rPr>
+        <w:t>6.2 Heart failure as a heterogeneous exposure</w:t>
+      </w:r>
+    </w:p>
+    <w:p>
+      <w:r>
+        <w:t>This screen treated heart failure as one exposure. Each limitation of that choice is answerable with existing cohort designs, and each is a stratification the compatibility score accepts without modification, because the scoring module consumes a feature matrix and a vector of source-derived weights and is indifferent to how the source group was defined. The guardrails travel with it: a severity-stratified or etiology-stratified rerun inherits the expression floor and the matched null whether or not whoever runs it has read this paper.</w:t>
+      </w:r>
+    </w:p>
+    <w:p>
+      <w:r>
+        <w:rPr>
+          <w:b/>
+        </w:rPr>
+        <w:t>Etiology.</w:t>
+      </w:r>
+      <w:r>
+        <w:t xml:space="preserve"> Stratifying the 42 upregulated secreted ligands by cardiomyopathy subtype found 12 with etiology-specific induction in at least one cohort, none cardiac-enriched at rank 1, and two clearing the abundance bar set by NPPA and NPPB, so pooling did not conceal a candidate axis (Section 3.1). That test covers dilated, ischemic and hypertrophic cardiomyopathy with strata of 37, 13 and 28 patients, and a null in the two small strata is low power rather than demonstrated absence. Pressure overload from aortic stenosis, volume overload from mitral regurgitation and inflammatory myocarditis impose mechanically and immunologically distinct stresses, and there is no reason to assume their secreted programs are the union of what dilated and ischemic disease produce. Myocarditis is the pointed case: the one mediator this screen was structurally unable to recover, SerpinA3, an acute-phase protease inhibitor (Section 3.13), is exactly the class of molecule an inflammatory etiology would elevate.</w:t>
+      </w:r>
+    </w:p>
+    <w:p>
+      <w:r>
+        <w:rPr>
+          <w:b/>
+        </w:rPr>
+        <w:t>Disease stage.</w:t>
+      </w:r>
+      <w:r>
+        <w:t xml:space="preserve"> Explanted ventricles come from transplant recipients, so every case is end-stage disease under maximal therapy. Early-stage heart failure, where the epidemiological association with cancer incidence would have to originate if the relationship is causal, is not represented in any tissue cohort and cannot be, since those patients are not undergoing cardiectomy. Endomyocardial biopsy series and circulating markers are the only accessible windows onto that stage. This is a structural limit on the tissue-transcriptomic approach to this question rather than a gap in the present study.</w:t>
+      </w:r>
+    </w:p>
+    <w:p>
+      <w:r>
+        <w:rPr>
+          <w:b/>
+        </w:rPr>
+        <w:t>Pharmacological treatment.</w:t>
+      </w:r>
+      <w:r>
+        <w:t xml:space="preserve"> Patients supplying these ventricles were on guideline-directed therapy, and the major drug classes alter the transcripts this screen scores: neurohormonal blockade changes natriuretic-peptide signaling, and mechanical unloading by a left ventricular assist device produces partial reverse remodeling with measurable transcriptional recovery. What is measured here is the treated failing ventricle, not the failing ventricle. Whether the secreted program of interest is a property of the disease or of the disease under therapy is answerable, since paired pre- and post-LVAD samples exist, and it should be answered before a circulating-ligand hypothesis is tested prospectively in a treated population.</w:t>
+      </w:r>
+    </w:p>
+    <w:p>
+      <w:pPr>
+        <w:pStyle w:val="Heading3"/>
+        <w:spacing w:line="240" w:lineRule="auto"/>
+      </w:pPr>
+      <w:r>
+        <w:rPr>
+          <w:rFonts w:ascii="Times New Roman" w:hAnsi="Times New Roman"/>
+          <w:color w:val="000000"/>
+        </w:rPr>
+        <w:t>6.3 Evaluation of delegated analysis</w:t>
+      </w:r>
+    </w:p>
+    <w:p>
+      <w:r>
+        <w:t>Section 4.7 reports what the split across 23 sub-agents did in this study and states what it did not test. That gap is a well-posed research direction: a task with a known ground truth is a better testbed for comparing a single-agent pipeline, a scripted workflow and an isolated multi-agent fleet than a screen whose answer is a negative, because it permits measuring not only accuracy but the rate at which each configuration commits and then propagates a methodological error. The delegation record released here (</w:t>
       </w:r>
       <w:r>
         <w:rPr>
@@ -3779,88 +3737,6 @@
       </w:r>
     </w:p>
     <w:p>
-      <w:r>
-        <w:rPr>
-          <w:b/>
-        </w:rPr>
-        <w:t>Integration with imaging data.</w:t>
-      </w:r>
-      <w:r>
-        <w:t xml:space="preserve"> The concrete extension of this screen is to replace its weakest measurements with imaging ones. Heart-failure status was a binary contrast between failing and non-failing explanted ventricles, which discards the severity, chamber geometry and fibrotic burden that cardiac MRI and echocardiography quantify routinely in living patients; late gadolinium enhancement and native T1 mapping index myocardial fibrosis directly, and strain imaging indexes dysfunction before an ejection-fraction threshold is crossed. If a ligand's release scales with fibrotic burden rather than with a diagnostic label, an imaging-derived severity score is the better exposure variable. On the receiver side, the analysis used bulk expression that mixes malignant, stromal and immune compartments, and TCGA carries diagnostic whole-slide images for most of the tumors scored here; a receptor enriched in bulk tissue but confined to stroma would not support a tumor-cell-intrinsic claim, and digital pathology tests that directly rather than inferring it. Both extensions require the imaging module described above, and both would inherit its guardrails. We have not built it, and this section is a specification rather than a result.</w:t>
-      </w:r>
-    </w:p>
-    <w:p>
-      <w:r>
-        <w:rPr>
-          <w:b/>
-        </w:rPr>
-        <w:t>Which heart failure?</w:t>
-      </w:r>
-      <w:r>
-        <w:t xml:space="preserve"> This screen treated heart failure as one exposure, and every limitation of that choice is a question a subsequent study can answer with existing cohort designs rather than new biology.</w:t>
-      </w:r>
-    </w:p>
-    <w:p>
-      <w:r>
-        <w:rPr>
-          <w:b/>
-        </w:rPr>
-        <w:t>Severity is not binary, and the design assumed it was.</w:t>
-      </w:r>
-      <w:r>
-        <w:t xml:space="preserve"> Cases were failing versus non-failing explanted ventricles, which collapses a continuum onto a label. If a ligand's release scales with fibrotic burden or wall stress rather than with a diagnostic category, the case-control contrast used here is the wrong estimator and would attenuate a real signal toward the null. The natriuretic peptides make the point concrete: NPPA and NPPB are clinically graded biomarkers whose plasma concentration tracks filling pressure across orders of magnitude, so a design that scores them as present-or-absent in tissue discards precisely the axis on which they carry information. The imaging-derived severity indices in the preceding subsection are one route to a continuous exposure; NYHA class, natriuretic-peptide concentration, and ejection fraction are others already recorded in most cardiology cohorts.</w:t>
-      </w:r>
-    </w:p>
-    <w:p>
-      <w:r>
-        <w:rPr>
-          <w:b/>
-        </w:rPr>
-        <w:t>Etiology was tested and did not change the conclusion, but only for three etiologies.</w:t>
-      </w:r>
-      <w:r>
-        <w:t xml:space="preserve"> Stratifying the 42 upregulated secreted ligands by cardiomyopathy subtype found 12 with etiology-specific induction in at least one cohort, none of which is cardiac-enriched at rank 1, and two of which clear the abundance bar set by NPPA and NPPB — so pooling did not conceal a candidate axis (Section 3.1). That test covers dilated, ischemic, and hypertrophic cardiomyopathy, with strata of 37, 13, and 28 patients, and a null in the two small strata is low power rather than demonstrated absence. It says nothing about the etiologies absent from these cohorts entirely. Pressure overload from aortic stenosis, volume overload from mitral regurgitation, and inflammatory myocarditis impose mechanically and immunologically distinct stresses on the ventricle, and there is no reason to assume their secreted programs are the union of what dilated and ischemic disease produce. Myocarditis in particular is an inflammatory state, and the one mediator this screen was structurally unable to recover — SerpinA3, an acute-phase protease inhibitor (Section 3.12) — is exactly the class of molecule an inflammatory etiology would be expected to elevate.</w:t>
-      </w:r>
-    </w:p>
-    <w:p>
-      <w:r>
-        <w:rPr>
-          <w:b/>
-        </w:rPr>
-        <w:t>Stage is confounded with tissue availability.</w:t>
-      </w:r>
-      <w:r>
-        <w:t xml:space="preserve"> Explanted ventricles come from transplant recipients, so every case here is end-stage disease under maximal therapy. Early-stage heart failure, which is where the epidemiological association with cancer incidence would have to originate if the relationship is causal, is not represented in any tissue cohort and cannot be, since those patients are not undergoing cardiectomy. Endomyocardial biopsy series and circulating markers are the only accessible windows onto that stage, and both trade tissue depth for accessibility. This is a structural limit on the entire tissue-transcriptomic approach to this question, not a gap in the present study.</w:t>
-      </w:r>
-    </w:p>
-    <w:p>
-      <w:r>
-        <w:rPr>
-          <w:b/>
-        </w:rPr>
-        <w:t>Treatment is an unmodeled exposure that acts on the same genes.</w:t>
-      </w:r>
-      <w:r>
-        <w:t xml:space="preserve"> Patients supplying these ventricles were on guideline-directed therapy, and the major drug classes demonstrably alter the transcripts this screen scores: neurohormonal blockade changes natriuretic-peptide signaling, and mechanical unloading by a left ventricular assist device produces partial reverse remodeling with measurable transcriptional recovery. What is measured here is therefore the treated failing ventricle, not the failing ventricle. Whether the secreted program of interest is a property of the disease or a property of the disease under therapy is an answerable question — paired pre- and post-LVAD samples exist — and it should be answered before a circulating-ligand hypothesis is tested prospectively in a treated population.</w:t>
-      </w:r>
-    </w:p>
-    <w:p>
-      <w:r>
-        <w:t>Each of these is a stratification the compatibility score can accept without modification, because the scoring module consumes a feature matrix and a vector of source-derived weights and is indifferent to how the source group was defined. The guardrails travel with it: a severity-stratified or etiology-stratified rerun inherits the expression floor and the matched null whether or not whoever runs it has read this paper.</w:t>
-      </w:r>
-    </w:p>
-    <w:p>
-      <w:r>
-        <w:rPr>
-          <w:b/>
-        </w:rPr>
-        <w:t>What this implies for how medicine gets done.</w:t>
-      </w:r>
-      <w:r>
-        <w:t xml:space="preserve"> The work these directions describe shares a shape with most translational questions now: the hypothesis is cheap to state, the data already exist across several public resources, and the difficulty is integration under methodological choices that determine the answer. That work is increasingly delegated to agents. This study argues that delegating it safely depends less on the capability of the agent than on where the methodological knowledge is written down. The pipeline nominated seven candidate axes and then destroyed them, at no cost beyond compute, because a criterion fixed in advance was enforced by code rather than by an analyst's memory. In a translational chain the alternative is expensive: a target that survives to a validation cohort, an animal model or a trial before the base rate that should have withdrawn it is computed. Screens of this kind are cheap to run and cheap to believe, and what makes them worth running is not the model performing the analysis but the encoded refusal to score what should not be scored.</w:t>
-      </w:r>
-    </w:p>
-    <w:p>
       <w:pPr>
         <w:pStyle w:val="Heading2"/>
         <w:spacing w:line="240" w:lineRule="auto"/>
@@ -3889,12 +3765,12 @@
     </w:p>
     <w:p>
       <w:r>
-        <w:t>Analysis code is available at https://github.com/nav92061/hf-crosstalk and is released as six skills, each comprising a documentation file plus a Python module: geo-bulk-de (GEO retrieval and moderated-t differential expression), hpa-secretome (protein-class annotation and secretion tiering), cellchat-lr (ligand–receptor parsing with receptor-complex expansion), tcga-pancan (memory-bounded streaming of the PanCanAtlas matrix), crosstalk-score (two-factor compatibility scoring with the floor, the matched-random null and the conjunction rule), and depmap-lineage (dependency screening with release resolution). The expression floor, the matched-random null and the conjunction rule are assertions that halt execution on violation rather than documented recommendations.</w:t>
-      </w:r>
-    </w:p>
-    <w:p>
-      <w:r>
-        <w:t>The skills carry no dependency on the environment used here: no language-model call, no API key, no platform function. They can be driven by another agent framework, or by a plain Python script with no agent at all, and the guardrails hold in every case because they are assertions in the code rather than instructions in a prompt. Continuous integration fails the build if a platform call appears in any module. The repository additionally carries the result tables, figures, pre-specifications, control log, and build_manuscript.py, which regenerates the typeset manuscript from source.</w:t>
+        <w:t>Analysis code is available at https://github.com/nav92061/hf-crosstalk and is released as the six skills itemized in Table 1, each comprising a documentation file plus a Python module. The expression floor, the matched-random null and the conjunction rule are assertions that halt execution on violation rather than documented recommendations.</w:t>
+      </w:r>
+    </w:p>
+    <w:p>
+      <w:r>
+        <w:t>The skills carry no dependency on the environment used here: no language-model call, no API key, no platform function. They can be driven by another agent framework, or by a plain Python script with no agent at all, and the guardrails hold in every case because they are assertions in the code rather than instructions in a prompt. Continuous integration fails the build if a platform call appears in any module. The repository additionally carries the result tables, figures, pre-specifications, control log, and build_manuscript.py, which regenerates the typeset manuscript from source. Every figure is regenerated from the released tables by figures/build_figures.py, which writes vector PDF with embedded fonts alongside raster PNG and requires neither network access nor a language-model call.</w:t>
       </w:r>
     </w:p>
     <w:p>
@@ -3904,7 +3780,7 @@
     </w:p>
     <w:p>
       <w:r>
-        <w:t>Sixty-eight numbered result tables, 8 figures, the pre-specifications for all three analysis phases, and a log of 197 controls and verdicts, including those that failed, accompany the code.</w:t>
+        <w:t>Sixty-eight numbered result tables, 8 figures, the pre-specifications for all three analysis phases, and a log of 264 controls and verdicts, including those that failed, accompany the code.</w:t>
       </w:r>
     </w:p>
     <w:p>
@@ -3951,7 +3827,7 @@
     </w:p>
     <w:p>
       <w:r>
-        <w:t>The analysis was executed by a hierarchical multi-agent system (one orchestrating agent and 23 sub-agent instances dispatched across five waves) operating on six deterministic, model-free analytical modules, under human design and audit (Sections 2.11, 4.6 and 4.8). N.A. specified the guardrails, audited every reported quantity against its source table, and is responsible for the final content. All authors reviewed the completed manuscript and take responsibility for the integrity of the analysis, including the portion executed by the agent pipeline described in Section 2.11.</w:t>
+        <w:t>The analysis was executed by a hierarchical multi-agent system (one orchestrating agent and 23 sub-agent instances dispatched across five waves) operating on six deterministic, model-free analytical modules, under human design and audit (Sections 2.11 and 4.7). N.A. specified the guardrails, audited every reported quantity against its source table, and is responsible for the final content. All authors reviewed the completed manuscript and take responsibility for the integrity of the analysis, including the portion executed by the agent pipeline described in Section 2.11.</w:t>
       </w:r>
     </w:p>
     <w:p>
@@ -4018,12 +3894,12 @@
           <w:rFonts w:ascii="Times New Roman" w:hAnsi="Times New Roman"/>
           <w:color w:val="000000"/>
         </w:rPr>
-        <w:t>Reporting guidelines</w:t>
-      </w:r>
-    </w:p>
-    <w:p>
-      <w:r>
-        <w:t>As a computational reanalysis rather than a clinical or animal study, no single existing reporting checklist (e.g., STROBE, ARRIVE) applies in full. The manuscript instead follows, and reports adherence to, the pre-specification, multiplicity-correction, matched-null, and negative-control conventions detailed in Section 2.12 and cross-referenced at each point of use (Sections 2.5-2.8, 3.9). Pre-registration of thresholds within phases is stated explicitly wherever a criterion is applied.</w:t>
+        <w:t>Acknowledgments</w:t>
+      </w:r>
+    </w:p>
+    <w:p>
+      <w:r>
+        <w:t>The authors thank the patients and donor families whose tissue made the primary datasets possible, and the consortia that curate and release them: the Gene Expression Omnibus, TCGA and the PanCanAtlas, GTEx, CPTAC and the Proteomic Data Commons, DepMap, the Human Protein Atlas, and the maintainers of CellChatDB. This work is entirely a reanalysis of their data.</w:t>
       </w:r>
     </w:p>
     <w:p>
@@ -4036,30 +3912,17 @@
           <w:rFonts w:ascii="Times New Roman" w:hAnsi="Times New Roman"/>
           <w:color w:val="000000"/>
         </w:rPr>
-        <w:t>Acknowledgments</w:t>
-      </w:r>
-    </w:p>
-    <w:p>
-      <w:r>
-        <w:t>The authors thank the patients and donor families whose tissue made the primary datasets possible, and the consortia that curate and release them: the Gene Expression Omnibus, TCGA and the PanCanAtlas, GTEx, CPTAC and the Proteomic Data Commons, DepMap, the Human Protein Atlas, and the maintainers of CellChatDB. This work is entirely a reanalysis of their data.</w:t>
-      </w:r>
-    </w:p>
-    <w:p>
-      <w:pPr>
-        <w:pStyle w:val="Heading2"/>
-        <w:spacing w:line="240" w:lineRule="auto"/>
-      </w:pPr>
-      <w:r>
-        <w:rPr>
-          <w:rFonts w:ascii="Times New Roman" w:hAnsi="Times New Roman"/>
-          <w:color w:val="000000"/>
-        </w:rPr>
-        <w:t>Declaration of generative AI and AI-assisted technologies in the writing process</w:t>
-      </w:r>
-    </w:p>
-    <w:p>
-      <w:r>
-        <w:t xml:space="preserve">During the preparation of this work the authors used Claude (Anthropic) both to execute the computational analysis and to draft the manuscript text. The distinction matters for this declaration. Use of AI to analyze data and draw insights is part of the research process and is described in full in Sections 2.11 and 4.8, including the delegation record, per-track costs and failure modes; it is a reported method of the study rather than a writing aid. Separately, and within the scope of this declaration, the same system was used to draft and revise manuscript text. Every numerical claim was verified against its source table, corrections were logged in </w:t>
+        <w:t>Declaration of generative AI and AI-assisted technologies in the manuscript preparation process</w:t>
+      </w:r>
+    </w:p>
+    <w:p>
+      <w:r>
+        <w:t>During the preparation of this work, the authors used Claude (Anthropic) for drafting and revising the manuscript text. The authors reviewed and edited the output as needed and take full responsibility for the content of the published article.</w:t>
+      </w:r>
+    </w:p>
+    <w:p>
+      <w:r>
+        <w:t xml:space="preserve">The same system also executed the computational analysis. That use is part of the research process rather than of manuscript preparation, and it is therefore reported as a method of the study in Sections 2.11 and 4.8, which give the delegation record, per-track costs and failure modes. Every numerical claim in the manuscript was verified against its source table and every correction was logged in </w:t>
       </w:r>
       <w:r>
         <w:rPr>
@@ -4069,7 +3932,7 @@
         <w:t>validation_summary.csv</w:t>
       </w:r>
       <w:r>
-        <w:t>, and no figure or image was generated or altered by AI: all figures are matplotlib renderings of the analysis outputs. The authors reviewed and edited the content and take full responsibility for the content of the published article.</w:t>
+        <w:t xml:space="preserve"> (Section 7). No figure or image was generated or altered by generative AI; all figures are renderings of the analysis outputs produced by the analysis code.</w:t>
       </w:r>
     </w:p>
     <w:p>
@@ -4127,7 +3990,7 @@
     </w:p>
     <w:p>
       <w:r>
-        <w:t>9. van den Berg PF, Yousif LI, Koop Y, et al. Framingham risk score associates with incident cancer and heart failure. Eur J Prev Cardiol 2026;33(4):490-497. doi:10.1093/eurjpc/zwaf618.</w:t>
+        <w:t>9. van den Berg PF, Yousif LI, Koop Y, et al. Framingham risk score associates with incident cancer and heart failure. Eur J Prev Cardiol 2026;33(4):490-497. doi:10.1093/eurjpc/zwaf618. Published online 27 September 2025.</w:t>
       </w:r>
     </w:p>
     <w:p>
@@ -4362,7 +4225,7 @@
     </w:p>
     <w:p>
       <w:r>
-        <w:t>56. Caller T, Weiss L, Sharon E, et al. Human heart-tumor interaction in ischemic / failing heart is mediated by cardiac mesenchymal stromal cells. Eur Heart J 2025. doi:10.1093/eurheartj/ehaf784.4672.</w:t>
+        <w:t>56. Caller T, Weiss L, Sharon E, et al. Human heart-tumor interaction in ischemic / failing heart is mediated by cardiac mesenchymal stromal cells [abstract]. Eur Heart J 2025;46(Suppl 1):ehaf784.4672. doi:10.1093/eurheartj/ehaf784.4672.</w:t>
       </w:r>
     </w:p>
     <w:sectPr>

</xml_diff>